<commit_message>
Add Script-Controlled ACL project documentation
</commit_message>
<xml_diff>
--- a/02_Data_Flow_Diagrams_and_User_Stories.docx
+++ b/02_Data_Flow_Diagrams_and_User_Stories.docx
@@ -9,9 +9,9 @@
       <w:r>
         <w:rPr>
           <w:b/>
-          <w:sz w:val="32"/>
+          <w:sz w:val="40"/>
         </w:rPr>
-        <w:t>Data Flow Diagrams and User Stories</w:t>
+        <w:t>DATA FLOW DIAGRAMS AND USER STORIES</w:t>
       </w:r>
     </w:p>
     <w:p>
@@ -20,7 +20,8 @@
       </w:pPr>
       <w:r>
         <w:rPr>
-          <w:b/>
+          <w:i/>
+          <w:sz w:val="22"/>
         </w:rPr>
         <w:t>Script-Controlled ACL – Restrict Record Access Based on Field Value</w:t>
       </w:r>
@@ -30,17 +31,58 @@
         <w:pStyle w:val="Heading1"/>
       </w:pPr>
       <w:r>
-        <w:t>Project Details</w:t>
+        <w:t>1. Data Flow</w:t>
       </w:r>
     </w:p>
     <w:p>
       <w:r>
-        <w:t>Project Title: Script-Controlled ACL – Restrict Record Access Based on Field Value</w:t>
+        <w:t>The Script-Controlled ACL follows this process:</w:t>
       </w:r>
     </w:p>
     <w:p>
+      <w:pPr>
+        <w:pStyle w:val="NoSpacing"/>
+        <w:spacing w:before="80" w:after="120"/>
+        <w:ind w:left="504"/>
+      </w:pPr>
       <w:r>
-        <w:t>Project Area: ServiceNow Administrator – Incident Access Control</w:t>
+        <w:rPr>
+          <w:rFonts w:ascii="Courier New" w:hAnsi="Courier New"/>
+          <w:sz w:val="18"/>
+        </w:rPr>
+        <w:t>User</w:t>
+        <w:br/>
+        <w:t xml:space="preserve">  ↓</w:t>
+        <w:br/>
+        <w:t>Incident Record Request</w:t>
+        <w:br/>
+        <w:t xml:space="preserve">  ↓</w:t>
+        <w:br/>
+        <w:t>ServiceNow</w:t>
+        <w:br/>
+        <w:t xml:space="preserve">  ↓</w:t>
+        <w:br/>
+        <w:t>ACL Engine</w:t>
+        <w:br/>
+        <w:t xml:space="preserve">  ↓</w:t>
+        <w:br/>
+        <w:t>Scripted Field Check</w:t>
+        <w:br/>
+        <w:t xml:space="preserve">  ↓</w:t>
+        <w:br/>
+        <w:t>Check Incident Field Value</w:t>
+        <w:br/>
+        <w:t xml:space="preserve">  ↓</w:t>
+        <w:br/>
+        <w:t>Check User Authorization</w:t>
+        <w:br/>
+        <w:t xml:space="preserve">  ↓</w:t>
+        <w:br/>
+        <w:t>Allow / Deny Decision</w:t>
+        <w:br/>
+        <w:t xml:space="preserve">  ↓</w:t>
+        <w:br/>
+        <w:t>ServiceNow Response</w:t>
       </w:r>
     </w:p>
     <w:p>
@@ -48,57 +90,189 @@
         <w:pStyle w:val="Heading1"/>
       </w:pPr>
       <w:r>
-        <w:t>Project Content</w:t>
+        <w:t>Detailed Data Flow</w:t>
       </w:r>
     </w:p>
     <w:p>
       <w:pPr>
-        <w:pStyle w:val="ListBullet"/>
+        <w:pStyle w:val="ListNumber"/>
       </w:pPr>
       <w:r>
-        <w:t>Data flow: User → Incident Record → ACL Evaluation → Script checks field value/user authorization → Access Granted or Access Denied.</w:t>
+        <w:t>User requests access to an Incident record.</w:t>
       </w:r>
     </w:p>
     <w:p>
       <w:pPr>
-        <w:pStyle w:val="ListBullet"/>
+        <w:pStyle w:val="ListNumber"/>
       </w:pPr>
       <w:r>
-        <w:t>User story 1: As a ServiceNow administrator, I want to restrict Incident access based on a field value so that protected records are available only to authorized users.</w:t>
+        <w:t>ServiceNow identifies the requested operation, such as Read or Write.</w:t>
       </w:r>
     </w:p>
     <w:p>
       <w:pPr>
-        <w:pStyle w:val="ListBullet"/>
+        <w:pStyle w:val="ListNumber"/>
       </w:pPr>
       <w:r>
-        <w:t>User story 2: As an authorized user, I want access when I satisfy the configured rule.</w:t>
+        <w:t>The ACL engine identifies the applicable Incident ACL.</w:t>
       </w:r>
     </w:p>
     <w:p>
       <w:pPr>
-        <w:pStyle w:val="ListBullet"/>
+        <w:pStyle w:val="ListNumber"/>
       </w:pPr>
       <w:r>
-        <w:t>User story 3: As an unauthorized user, I want the system to deny access when I do not satisfy the rule.</w:t>
+        <w:t>The ACL script reads the required field from the Incident record.</w:t>
       </w:r>
     </w:p>
     <w:p>
       <w:pPr>
-        <w:pStyle w:val="ListBullet"/>
+        <w:pStyle w:val="ListNumber"/>
       </w:pPr>
       <w:r>
-        <w:t>Acceptance criteria: The ACL evaluates the required field; authorized cases are allowed; unauthorized cases are denied; the rule can be tested.</w:t>
+        <w:t>The script evaluates the configured security condition.</w:t>
+      </w:r>
+    </w:p>
+    <w:p>
+      <w:pPr>
+        <w:pStyle w:val="ListNumber"/>
+      </w:pPr>
+      <w:r>
+        <w:t>The script returns either true (Allow access) or false (Deny access).</w:t>
+      </w:r>
+    </w:p>
+    <w:p>
+      <w:pPr>
+        <w:pStyle w:val="ListNumber"/>
+      </w:pPr>
+      <w:r>
+        <w:t>ServiceNow completes or blocks the requested operation.</w:t>
+      </w:r>
+    </w:p>
+    <w:p>
+      <w:pPr>
+        <w:pStyle w:val="Heading1"/>
+      </w:pPr>
+      <w:r>
+        <w:t>2. User Stories</w:t>
+      </w:r>
+    </w:p>
+    <w:p>
+      <w:pPr>
+        <w:pStyle w:val="Heading2"/>
+      </w:pPr>
+      <w:r>
+        <w:t>US-01 – Create ACL</w:t>
+      </w:r>
+    </w:p>
+    <w:p>
+      <w:r>
+        <w:t>User Story: As a ServiceNow administrator, I can create an ACL for Incident records.</w:t>
+      </w:r>
+    </w:p>
+    <w:p>
+      <w:r>
+        <w:t>Acceptance Criteria: ACL is created successfully; ACL is active; ACL applies to the Incident table; ACL applies to the intended operation. Priority: High.</w:t>
+      </w:r>
+    </w:p>
+    <w:p>
+      <w:pPr>
+        <w:pStyle w:val="Heading2"/>
+      </w:pPr>
+      <w:r>
+        <w:t>US-02 – Evaluate Field Value</w:t>
+      </w:r>
+    </w:p>
+    <w:p>
+      <w:r>
+        <w:t>User Story: As a ServiceNow administrator, I can use a script to evaluate an Incident field value.</w:t>
+      </w:r>
+    </w:p>
+    <w:p>
+      <w:r>
+        <w:t>Acceptance Criteria: Script reads the selected Incident field; script evaluates the configured value; script returns the correct allow/deny result. Priority: High.</w:t>
+      </w:r>
+    </w:p>
+    <w:p>
+      <w:pPr>
+        <w:pStyle w:val="Heading2"/>
+      </w:pPr>
+      <w:r>
+        <w:t>US-03 – Authorized User</w:t>
+      </w:r>
+    </w:p>
+    <w:p>
+      <w:r>
+        <w:t>User Story: As an authorized user, I can access a protected Incident when the ACL permits access.</w:t>
+      </w:r>
+    </w:p>
+    <w:p>
+      <w:r>
+        <w:t>Acceptance Criteria: Authorized user can access the protected Incident; requested operation succeeds. Priority: High.</w:t>
+      </w:r>
+    </w:p>
+    <w:p>
+      <w:pPr>
+        <w:pStyle w:val="Heading2"/>
+      </w:pPr>
+      <w:r>
+        <w:t>US-04 – Unauthorized User</w:t>
+      </w:r>
+    </w:p>
+    <w:p>
+      <w:r>
+        <w:t>User Story: As an unauthorized user, I cannot access a protected Incident.</w:t>
+      </w:r>
+    </w:p>
+    <w:p>
+      <w:r>
+        <w:t>Acceptance Criteria: Unauthorized user is denied access; protected information is not exposed. Priority: High.</w:t>
+      </w:r>
+    </w:p>
+    <w:p>
+      <w:pPr>
+        <w:pStyle w:val="Heading2"/>
+      </w:pPr>
+      <w:r>
+        <w:t>US-05 – Test Different Values</w:t>
+      </w:r>
+    </w:p>
+    <w:p>
+      <w:r>
+        <w:t>User Story: As a ServiceNow administrator, I can test different Incident field values.</w:t>
+      </w:r>
+    </w:p>
+    <w:p>
+      <w:r>
+        <w:t>Acceptance Criteria: Changing the field value changes the access decision according to the configured rule. Priority: Medium.</w:t>
       </w:r>
     </w:p>
     <w:sectPr>
+      <w:footerReference w:type="default" r:id="rId9"/>
       <w:pgSz w:w="12240" w:h="15840"/>
-      <w:pgMar w:top="1440" w:right="1800" w:bottom="1440" w:left="1800" w:header="720" w:footer="720" w:gutter="0"/>
+      <w:pgMar w:top="1008" w:right="1152" w:bottom="1008" w:left="1152" w:header="720" w:footer="720" w:gutter="0"/>
       <w:cols w:space="720"/>
       <w:docGrid w:linePitch="360"/>
     </w:sectPr>
   </w:body>
 </w:document>
+</file>
+
+<file path=word/footer1.xml><?xml version="1.0" encoding="utf-8"?>
+<w:ftr xmlns:m="http://schemas.openxmlformats.org/officeDocument/2006/math" xmlns:mc="http://schemas.openxmlformats.org/markup-compatibility/2006" xmlns:mo="http://schemas.microsoft.com/office/mac/office/2008/main" xmlns:mv="urn:schemas-microsoft-com:mac:vml" xmlns:o="urn:schemas-microsoft-com:office:office" xmlns:r="http://schemas.openxmlformats.org/officeDocument/2006/relationships" xmlns:v="urn:schemas-microsoft-com:vml" xmlns:w10="urn:schemas-microsoft-com:office:word" xmlns:w14="http://schemas.microsoft.com/office/word/2010/wordml" xmlns:w="http://schemas.openxmlformats.org/wordprocessingml/2006/main" xmlns:wne="http://schemas.microsoft.com/office/word/2006/wordml" xmlns:wp14="http://schemas.microsoft.com/office/word/2010/wordprocessingDrawing" xmlns:wp="http://schemas.openxmlformats.org/drawingml/2006/wordprocessingDrawing" xmlns:wpc="http://schemas.microsoft.com/office/word/2010/wordprocessingCanvas" xmlns:wpg="http://schemas.microsoft.com/office/word/2010/wordprocessingGroup" xmlns:wpi="http://schemas.microsoft.com/office/word/2010/wordprocessingInk" xmlns:wps="http://schemas.microsoft.com/office/word/2010/wordprocessingShape" mc:Ignorable="w14 wp14">
+  <w:p>
+    <w:pPr>
+      <w:pStyle w:val="Footer"/>
+      <w:jc w:val="center"/>
+    </w:pPr>
+    <w:r>
+      <w:rPr>
+        <w:sz w:val="16"/>
+      </w:rPr>
+      <w:t>Script-Controlled ACL Project</w:t>
+    </w:r>
+  </w:p>
+</w:ftr>
 </file>
 
 <file path=word/numbering.xml><?xml version="1.0" encoding="utf-8"?>
@@ -466,7 +640,7 @@
     <w:rsid w:val="00FC693F"/>
     <w:rPr>
       <w:rFonts w:ascii="Arial" w:hAnsi="Arial"/>
-      <w:sz w:val="22"/>
+      <w:sz w:val="21"/>
     </w:rPr>
   </w:style>
   <w:style w:type="paragraph" w:styleId="Header">
@@ -528,11 +702,11 @@
       <w:outlineLvl w:val="0"/>
     </w:pPr>
     <w:rPr>
-      <w:rFonts w:asciiTheme="majorHAnsi" w:eastAsiaTheme="majorEastAsia" w:hAnsiTheme="majorHAnsi" w:cstheme="majorBidi"/>
+      <w:rFonts w:asciiTheme="majorHAnsi" w:eastAsiaTheme="majorEastAsia" w:hAnsiTheme="majorHAnsi" w:cstheme="majorBidi" w:ascii="Arial" w:hAnsi="Arial"/>
       <w:b/>
       <w:bCs/>
       <w:color w:val="365F91" w:themeColor="accent1" w:themeShade="BF"/>
-      <w:sz w:val="28"/>
+      <w:sz w:val="32"/>
       <w:szCs w:val="28"/>
     </w:rPr>
   </w:style>
@@ -552,7 +726,7 @@
       <w:outlineLvl w:val="1"/>
     </w:pPr>
     <w:rPr>
-      <w:rFonts w:asciiTheme="majorHAnsi" w:eastAsiaTheme="majorEastAsia" w:hAnsiTheme="majorHAnsi" w:cstheme="majorBidi"/>
+      <w:rFonts w:asciiTheme="majorHAnsi" w:eastAsiaTheme="majorEastAsia" w:hAnsiTheme="majorHAnsi" w:cstheme="majorBidi" w:ascii="Arial" w:hAnsi="Arial"/>
       <w:b/>
       <w:bCs/>
       <w:color w:val="4F81BD" w:themeColor="accent1"/>
@@ -576,10 +750,11 @@
       <w:outlineLvl w:val="2"/>
     </w:pPr>
     <w:rPr>
-      <w:rFonts w:asciiTheme="majorHAnsi" w:eastAsiaTheme="majorEastAsia" w:hAnsiTheme="majorHAnsi" w:cstheme="majorBidi"/>
+      <w:rFonts w:asciiTheme="majorHAnsi" w:eastAsiaTheme="majorEastAsia" w:hAnsiTheme="majorHAnsi" w:cstheme="majorBidi" w:ascii="Arial" w:hAnsi="Arial"/>
       <w:b/>
       <w:bCs/>
       <w:color w:val="4F81BD" w:themeColor="accent1"/>
+      <w:sz w:val="22"/>
     </w:rPr>
   </w:style>
   <w:style w:type="paragraph" w:styleId="Heading4">
@@ -817,11 +992,11 @@
       <w:contextualSpacing/>
     </w:pPr>
     <w:rPr>
-      <w:rFonts w:asciiTheme="majorHAnsi" w:eastAsiaTheme="majorEastAsia" w:hAnsiTheme="majorHAnsi" w:cstheme="majorBidi"/>
+      <w:rFonts w:asciiTheme="majorHAnsi" w:eastAsiaTheme="majorEastAsia" w:hAnsiTheme="majorHAnsi" w:cstheme="majorBidi" w:ascii="Arial" w:hAnsi="Arial"/>
       <w:color w:val="17365D" w:themeColor="text2" w:themeShade="BF"/>
       <w:spacing w:val="5"/>
       <w:kern w:val="28"/>
-      <w:sz w:val="52"/>
+      <w:sz w:val="40"/>
       <w:szCs w:val="52"/>
     </w:rPr>
   </w:style>

</xml_diff>